<commit_message>
feat: huurcontract PL en RO, einddatum 6 mnd - 1 dag (max 26 wkn), geen geel, H. Jager
- Sjablonen Pools en Roemeens: vertaling onder elke alinea, gekoppeld op tekst
  (haal_vertaling.py vergelijkt de Nederlandse tekst, opbouw bronbestand maakt
  niet uit). Gaten in de RDM-sjablonen aangevuld en vastgelegd in het script:
  PL mist art. 1.1 (eigen vertaling, laten controleren), RO 2.1/2.2 omgewisseld,
  RO-labels Huurbevestiging gecorrigeerd. Controlelijsten in vertalingen/.
- Alle gele markering weg; ondertekenaar verhuurder H. Jager; vertaling bij het
  handtekeningblok (EN); handtekeningblok niet meer over twee pagina's.
- Einddatum = eerste aankomst + 6 maanden - 1 dag, maar nooit later dan 26 weken
  (+181 dagen, maximum volgens het contract). App en huurovereenkomsten_sync();
  11 bestaande regels (status te_maken) bijgewerkt.

Co-Authored-By: Claude Opus 5.5 <noreply@anthropic.com>
Claude-Session: https://claude.ai/code/session_01SAAzUTQoYuHM6bVGxVPSz1
</commit_message>
<xml_diff>
--- a/public/sjablonen/huurovereenkomst_EN.docx
+++ b/public/sjablonen/huurovereenkomst_EN.docx
@@ -2317,111 +2317,95 @@
         <w:jc w:val="both"/>
         <w:rPr>
           <w:szCs w:val="22"/>
-          <w:highlight w:val="yellow"/>
-        </w:rPr>
-      </w:pPr>
-      <w:r>
-        <w:rPr>
-          <w:szCs w:val="22"/>
-          <w:highlight w:val="yellow"/>
+        </w:rPr>
+      </w:pPr>
+      <w:r>
+        <w:rPr>
+          <w:szCs w:val="22"/>
         </w:rPr>
         <w:t>De Overeenkomst is aangegaan voor de duur van de arbeidsovereenkomst van Huurder</w:t>
       </w:r>
       <w:r>
         <w:rPr>
           <w:szCs w:val="22"/>
-          <w:highlight w:val="yellow"/>
         </w:rPr>
         <w:t xml:space="preserve">, te vermeerderen met een termijn van </w:t>
       </w:r>
       <w:r>
         <w:rPr>
           <w:szCs w:val="22"/>
-          <w:highlight w:val="yellow"/>
         </w:rPr>
         <w:t xml:space="preserve">één </w:t>
       </w:r>
       <w:r>
         <w:rPr>
           <w:szCs w:val="22"/>
-          <w:highlight w:val="yellow"/>
         </w:rPr>
         <w:t>maand</w:t>
       </w:r>
       <w:r>
         <w:rPr>
           <w:szCs w:val="22"/>
-          <w:highlight w:val="yellow"/>
         </w:rPr>
         <w:t xml:space="preserve"> (conform artikel 36 lid 5 van de </w:t>
       </w:r>
       <w:r>
         <w:rPr>
           <w:szCs w:val="22"/>
-          <w:highlight w:val="yellow"/>
         </w:rPr>
         <w:t>thans geldende NBBU-</w:t>
       </w:r>
       <w:r>
         <w:rPr>
           <w:szCs w:val="22"/>
-          <w:highlight w:val="yellow"/>
         </w:rPr>
         <w:t>Cao voor Uitzendkrachten)</w:t>
       </w:r>
       <w:r>
         <w:rPr>
           <w:szCs w:val="22"/>
-          <w:highlight w:val="yellow"/>
         </w:rPr>
         <w:t>.</w:t>
       </w:r>
       <w:r>
         <w:rPr>
           <w:szCs w:val="22"/>
-          <w:highlight w:val="yellow"/>
         </w:rPr>
         <w:t xml:space="preserve"> De maximale duur van deze Overeenkomst is gelijk aan de maximale duur van de arbeidsovereenkomst, zijnde 26 weken.</w:t>
       </w:r>
       <w:r>
         <w:rPr>
           <w:szCs w:val="22"/>
-          <w:highlight w:val="yellow"/>
         </w:rPr>
         <w:t xml:space="preserve"> De werkgever</w:t>
       </w:r>
       <w:r>
         <w:rPr>
           <w:szCs w:val="22"/>
-          <w:highlight w:val="yellow"/>
         </w:rPr>
         <w:t xml:space="preserve"> van Huurder</w:t>
       </w:r>
       <w:r>
         <w:rPr>
           <w:szCs w:val="22"/>
-          <w:highlight w:val="yellow"/>
         </w:rPr>
         <w:t xml:space="preserve"> en duur van de Overeenkomst staan</w:t>
       </w:r>
       <w:r>
         <w:rPr>
           <w:szCs w:val="22"/>
-          <w:highlight w:val="yellow"/>
         </w:rPr>
         <w:t xml:space="preserve"> gespecificeerd in de Huurbevestiging</w:t>
       </w:r>
       <w:r>
         <w:rPr>
           <w:szCs w:val="22"/>
-          <w:highlight w:val="yellow"/>
         </w:rPr>
         <w:t>.</w:t>
       </w:r>
       <w:r>
         <w:rPr>
           <w:szCs w:val="22"/>
-          <w:highlight w:val="yellow"/>
         </w:rPr>
         <w:t xml:space="preserve"> </w:t>
       </w:r>
@@ -2460,13 +2444,11 @@
         <w:jc w:val="both"/>
         <w:rPr>
           <w:szCs w:val="22"/>
-          <w:highlight w:val="yellow"/>
-        </w:rPr>
-      </w:pPr>
-      <w:r>
-        <w:rPr>
-          <w:szCs w:val="22"/>
-          <w:highlight w:val="yellow"/>
+        </w:rPr>
+      </w:pPr>
+      <w:r>
+        <w:rPr>
+          <w:szCs w:val="22"/>
         </w:rPr>
         <w:t>OF</w:t>
       </w:r>
@@ -2508,13 +2490,11 @@
         <w:jc w:val="both"/>
         <w:rPr>
           <w:szCs w:val="22"/>
-          <w:highlight w:val="yellow"/>
-        </w:rPr>
-      </w:pPr>
-      <w:r>
-        <w:rPr>
-          <w:szCs w:val="22"/>
-          <w:highlight w:val="yellow"/>
+        </w:rPr>
+      </w:pPr>
+      <w:r>
+        <w:rPr>
+          <w:szCs w:val="22"/>
         </w:rPr>
         <w:t xml:space="preserve">De Overeenkomst is aangegaan voor de duur zoals opgenomen in de Huurbevestiging, doch is niet langer dan 26 weken. De werkgever van Huurder en duur van de Overeenkomst staan gespecificeerd in de Huurbevestiging. </w:t>
       </w:r>
@@ -8512,6 +8492,7 @@
     <w:p>
       <w:pPr>
         <w:pStyle w:val="PCStandaard"/>
+        <w:keepNext/>
         <w:spacing w:before="0" w:after="120" w:line="220" w:lineRule="auto"/>
         <w:jc w:val="both"/>
       </w:pPr>
@@ -8531,6 +8512,7 @@
     <w:p>
       <w:pPr>
         <w:pStyle w:val="PCStandaard"/>
+        <w:keepNext/>
         <w:jc w:val="both"/>
         <w:rPr>
           <w:rFonts w:cs="Arial"/>
@@ -8558,6 +8540,7 @@
       </w:tblGrid>
       <w:tr>
         <w:trPr>
+          <w:cantSplit/>
           <w:trHeight w:val="393"/>
         </w:trPr>
         <w:tc>
@@ -8567,6 +8550,8 @@
           <w:p>
             <w:pPr>
               <w:pStyle w:val="Plattetekst"/>
+              <w:keepNext/>
+              <w:spacing w:after="20"/>
               <w:suppressAutoHyphens/>
               <w:jc w:val="both"/>
               <w:rPr>
@@ -8583,6 +8568,27 @@
               <w:t>Verhuurder</w:t>
             </w:r>
           </w:p>
+          <w:p>
+            <w:pPr>
+              <w:pStyle w:val="Plattetekst"/>
+              <w:keepNext/>
+              <w:suppressAutoHyphens/>
+              <w:spacing w:before="0" w:after="120" w:line="220" w:lineRule="auto"/>
+              <w:jc w:val="both"/>
+            </w:pPr>
+            <w:r>
+              <w:rPr>
+                <w:rFonts w:ascii="Arial" w:hAnsi="Arial" w:cs="Arial"/>
+                <w:i/>
+                <w:iCs/>
+                <w:color w:val="808080"/>
+                <w:sz w:val="16"/>
+                <w:szCs w:val="16"/>
+                <w:lang w:val="en-US"/>
+              </w:rPr>
+              <w:t xml:space="preserve">Landlord</w:t>
+            </w:r>
+          </w:p>
         </w:tc>
         <w:tc>
           <w:tcPr>
@@ -8591,6 +8597,8 @@
           <w:p>
             <w:pPr>
               <w:pStyle w:val="Plattetekst"/>
+              <w:keepNext/>
+              <w:spacing w:after="20"/>
               <w:suppressAutoHyphens/>
               <w:jc w:val="both"/>
               <w:rPr>
@@ -8607,10 +8615,32 @@
               <w:t>Huurder</w:t>
             </w:r>
           </w:p>
+          <w:p>
+            <w:pPr>
+              <w:pStyle w:val="Plattetekst"/>
+              <w:keepNext/>
+              <w:suppressAutoHyphens/>
+              <w:spacing w:before="0" w:after="120" w:line="220" w:lineRule="auto"/>
+              <w:jc w:val="both"/>
+            </w:pPr>
+            <w:r>
+              <w:rPr>
+                <w:rFonts w:ascii="Arial" w:hAnsi="Arial" w:cs="Arial"/>
+                <w:i/>
+                <w:iCs/>
+                <w:color w:val="808080"/>
+                <w:sz w:val="16"/>
+                <w:szCs w:val="16"/>
+                <w:lang w:val="en-US"/>
+              </w:rPr>
+              <w:t xml:space="preserve">Tenant</w:t>
+            </w:r>
+          </w:p>
         </w:tc>
       </w:tr>
       <w:tr>
         <w:trPr>
+          <w:cantSplit/>
           <w:trHeight w:val="393"/>
         </w:trPr>
         <w:tc>
@@ -8620,6 +8650,7 @@
           <w:p>
             <w:pPr>
               <w:pStyle w:val="Plattetekst"/>
+              <w:keepNext/>
               <w:suppressAutoHyphens/>
               <w:jc w:val="both"/>
               <w:rPr>
@@ -8642,6 +8673,7 @@
           <w:p>
             <w:pPr>
               <w:pStyle w:val="Plattetekst"/>
+              <w:keepNext/>
               <w:suppressAutoHyphens/>
               <w:jc w:val="both"/>
               <w:rPr>
@@ -8660,6 +8692,7 @@
       </w:tr>
       <w:tr>
         <w:trPr>
+          <w:cantSplit/>
           <w:trHeight w:val="393"/>
         </w:trPr>
         <w:tc>
@@ -8669,6 +8702,7 @@
           <w:p>
             <w:pPr>
               <w:pStyle w:val="Plattetekst"/>
+              <w:keepNext/>
               <w:suppressAutoHyphens/>
               <w:jc w:val="both"/>
               <w:rPr>
@@ -8684,6 +8718,7 @@
           <w:p>
             <w:pPr>
               <w:pStyle w:val="Plattetekst"/>
+              <w:keepNext/>
               <w:suppressAutoHyphens/>
               <w:jc w:val="both"/>
               <w:rPr>
@@ -8695,6 +8730,7 @@
       </w:tr>
       <w:tr>
         <w:trPr>
+          <w:cantSplit/>
           <w:trHeight w:val="393"/>
         </w:trPr>
         <w:tc>
@@ -8704,6 +8740,7 @@
           <w:p>
             <w:pPr>
               <w:pStyle w:val="Plattetekst"/>
+              <w:keepNext/>
               <w:suppressAutoHyphens/>
               <w:jc w:val="both"/>
               <w:rPr>
@@ -8725,6 +8762,7 @@
           <w:p>
             <w:pPr>
               <w:pStyle w:val="Plattetekst"/>
+              <w:keepNext/>
               <w:suppressAutoHyphens/>
               <w:jc w:val="both"/>
               <w:rPr>
@@ -8742,6 +8780,7 @@
       </w:tr>
       <w:tr>
         <w:trPr>
+          <w:cantSplit/>
           <w:trHeight w:val="393"/>
         </w:trPr>
         <w:tc>
@@ -8751,6 +8790,8 @@
           <w:p>
             <w:pPr>
               <w:pStyle w:val="Plattetekst"/>
+              <w:keepNext/>
+              <w:spacing w:after="20"/>
               <w:suppressAutoHyphens/>
               <w:jc w:val="both"/>
               <w:rPr>
@@ -8767,7 +8808,28 @@
               <w:rPr>
                 <w:rFonts w:cs="Arial"/>
               </w:rPr>
-              <w:t xml:space="preserve">: J. de Kruijf</w:t>
+              <w:t xml:space="preserve">: H. Jager</w:t>
+            </w:r>
+          </w:p>
+          <w:p>
+            <w:pPr>
+              <w:pStyle w:val="Plattetekst"/>
+              <w:keepNext/>
+              <w:suppressAutoHyphens/>
+              <w:spacing w:before="0" w:after="120" w:line="220" w:lineRule="auto"/>
+              <w:jc w:val="both"/>
+            </w:pPr>
+            <w:r>
+              <w:rPr>
+                <w:rFonts w:ascii="Arial" w:hAnsi="Arial" w:cs="Arial"/>
+                <w:i/>
+                <w:iCs/>
+                <w:color w:val="808080"/>
+                <w:sz w:val="16"/>
+                <w:szCs w:val="16"/>
+                <w:lang w:val="en-US"/>
+              </w:rPr>
+              <w:t xml:space="preserve">On behalf of:</w:t>
             </w:r>
           </w:p>
         </w:tc>
@@ -8778,6 +8840,8 @@
           <w:p>
             <w:pPr>
               <w:pStyle w:val="Plattetekst"/>
+              <w:keepNext/>
+              <w:spacing w:after="20"/>
               <w:suppressAutoHyphens/>
               <w:jc w:val="both"/>
               <w:rPr>
@@ -8797,10 +8861,32 @@
               <w:t xml:space="preserve">: {{Naam huurder}}</w:t>
             </w:r>
           </w:p>
+          <w:p>
+            <w:pPr>
+              <w:pStyle w:val="Plattetekst"/>
+              <w:keepNext/>
+              <w:suppressAutoHyphens/>
+              <w:spacing w:before="0" w:after="120" w:line="220" w:lineRule="auto"/>
+              <w:jc w:val="both"/>
+            </w:pPr>
+            <w:r>
+              <w:rPr>
+                <w:rFonts w:ascii="Arial" w:hAnsi="Arial" w:cs="Arial"/>
+                <w:i/>
+                <w:iCs/>
+                <w:color w:val="808080"/>
+                <w:sz w:val="16"/>
+                <w:szCs w:val="16"/>
+                <w:lang w:val="en-US"/>
+              </w:rPr>
+              <w:t xml:space="preserve">On behalf of:</w:t>
+            </w:r>
+          </w:p>
         </w:tc>
       </w:tr>
       <w:tr>
         <w:trPr>
+          <w:cantSplit/>
           <w:trHeight w:val="393"/>
         </w:trPr>
         <w:tc>
@@ -8810,6 +8896,8 @@
           <w:p>
             <w:pPr>
               <w:pStyle w:val="Plattetekst"/>
+              <w:keepNext/>
+              <w:spacing w:after="20"/>
               <w:suppressAutoHyphens/>
               <w:jc w:val="both"/>
               <w:rPr>
@@ -8841,6 +8929,27 @@
               <w:t xml:space="preserve">Enschede</w:t>
             </w:r>
           </w:p>
+          <w:p>
+            <w:pPr>
+              <w:pStyle w:val="Plattetekst"/>
+              <w:keepNext/>
+              <w:suppressAutoHyphens/>
+              <w:spacing w:before="0" w:after="120" w:line="220" w:lineRule="auto"/>
+              <w:jc w:val="both"/>
+            </w:pPr>
+            <w:r>
+              <w:rPr>
+                <w:rFonts w:ascii="Arial" w:hAnsi="Arial" w:cs="Arial"/>
+                <w:i/>
+                <w:iCs/>
+                <w:color w:val="808080"/>
+                <w:sz w:val="16"/>
+                <w:szCs w:val="16"/>
+                <w:lang w:val="en-US"/>
+              </w:rPr>
+              <w:t xml:space="preserve">Place:</w:t>
+            </w:r>
+          </w:p>
         </w:tc>
         <w:tc>
           <w:tcPr>
@@ -8849,6 +8958,8 @@
           <w:p>
             <w:pPr>
               <w:pStyle w:val="Plattetekst"/>
+              <w:keepNext/>
+              <w:spacing w:after="20"/>
               <w:suppressAutoHyphens/>
               <w:jc w:val="both"/>
               <w:rPr>
@@ -8880,10 +8991,32 @@
               <w:t xml:space="preserve">{{Plaats ondertekening}}</w:t>
             </w:r>
           </w:p>
+          <w:p>
+            <w:pPr>
+              <w:pStyle w:val="Plattetekst"/>
+              <w:keepNext/>
+              <w:suppressAutoHyphens/>
+              <w:spacing w:before="0" w:after="120" w:line="220" w:lineRule="auto"/>
+              <w:jc w:val="both"/>
+            </w:pPr>
+            <w:r>
+              <w:rPr>
+                <w:rFonts w:ascii="Arial" w:hAnsi="Arial" w:cs="Arial"/>
+                <w:i/>
+                <w:iCs/>
+                <w:color w:val="808080"/>
+                <w:sz w:val="16"/>
+                <w:szCs w:val="16"/>
+                <w:lang w:val="en-US"/>
+              </w:rPr>
+              <w:t xml:space="preserve">Place:</w:t>
+            </w:r>
+          </w:p>
         </w:tc>
       </w:tr>
       <w:tr>
         <w:trPr>
+          <w:cantSplit/>
           <w:trHeight w:val="393"/>
         </w:trPr>
         <w:tc>
@@ -8893,6 +9026,8 @@
           <w:p>
             <w:pPr>
               <w:pStyle w:val="Plattetekst"/>
+              <w:keepNext/>
+              <w:spacing w:after="20"/>
               <w:suppressAutoHyphens/>
               <w:jc w:val="both"/>
               <w:rPr>
@@ -8924,6 +9059,27 @@
               <w:t xml:space="preserve">{{Datum ondertekening}}</w:t>
             </w:r>
           </w:p>
+          <w:p>
+            <w:pPr>
+              <w:pStyle w:val="Plattetekst"/>
+              <w:keepNext/>
+              <w:suppressAutoHyphens/>
+              <w:spacing w:before="0" w:after="120" w:line="220" w:lineRule="auto"/>
+              <w:jc w:val="both"/>
+            </w:pPr>
+            <w:r>
+              <w:rPr>
+                <w:rFonts w:ascii="Arial" w:hAnsi="Arial" w:cs="Arial"/>
+                <w:i/>
+                <w:iCs/>
+                <w:color w:val="808080"/>
+                <w:sz w:val="16"/>
+                <w:szCs w:val="16"/>
+                <w:lang w:val="en-US"/>
+              </w:rPr>
+              <w:t xml:space="preserve">Date:</w:t>
+            </w:r>
+          </w:p>
         </w:tc>
         <w:tc>
           <w:tcPr>
@@ -8932,6 +9088,8 @@
           <w:p>
             <w:pPr>
               <w:pStyle w:val="Plattetekst"/>
+              <w:keepNext/>
+              <w:spacing w:after="20"/>
               <w:suppressAutoHyphens/>
               <w:jc w:val="both"/>
               <w:rPr>
@@ -8961,6 +9119,26 @@
                 <w:rFonts w:cs="Arial"/>
               </w:rPr>
               <w:t xml:space="preserve">{{Datum ondertekening}}</w:t>
+            </w:r>
+          </w:p>
+          <w:p>
+            <w:pPr>
+              <w:pStyle w:val="Plattetekst"/>
+              <w:suppressAutoHyphens/>
+              <w:spacing w:before="0" w:after="120" w:line="220" w:lineRule="auto"/>
+              <w:jc w:val="both"/>
+            </w:pPr>
+            <w:r>
+              <w:rPr>
+                <w:rFonts w:ascii="Arial" w:hAnsi="Arial" w:cs="Arial"/>
+                <w:i/>
+                <w:iCs/>
+                <w:color w:val="808080"/>
+                <w:sz w:val="16"/>
+                <w:szCs w:val="16"/>
+                <w:lang w:val="en-US"/>
+              </w:rPr>
+              <w:t xml:space="preserve">Date:</w:t>
             </w:r>
           </w:p>
         </w:tc>

</xml_diff>

<commit_message>
feat: handtekening H. Jager standaard in de huurovereenkomst
handtekening_verhuurder.png (witte achtergrond transparant gemaakt) staat in
de verhuurder-cel boven de streep, in alle talen; max. 2,2 cm hoog.

Co-Authored-By: Claude Opus 5.5 <noreply@anthropic.com>
Claude-Session: https://claude.ai/code/session_01SAAzUTQoYuHM6bVGxVPSz1
</commit_message>
<xml_diff>
--- a/public/sjablonen/huurovereenkomst_EN.docx
+++ b/public/sjablonen/huurovereenkomst_EN.docx
@@ -8709,6 +8709,42 @@
                 <w:rFonts w:cs="Arial"/>
               </w:rPr>
             </w:pPr>
+            <w:r xmlns:a="http://schemas.openxmlformats.org/drawingml/2006/main" xmlns:pic="http://schemas.openxmlformats.org/drawingml/2006/picture">
+              <w:drawing>
+                <wp:inline distT="0" distB="0" distL="0" distR="0">
+                  <wp:extent cx="313610" cy="792000"/>
+                  <wp:docPr id="9001" name="Handtekening verhuurder"/>
+                  <wp:cNvGraphicFramePr>
+                    <a:graphicFrameLocks noChangeAspect="1"/>
+                  </wp:cNvGraphicFramePr>
+                  <a:graphic>
+                    <a:graphicData uri="http://schemas.openxmlformats.org/drawingml/2006/picture">
+                      <pic:pic>
+                        <pic:nvPicPr>
+                          <pic:cNvPr id="9001" name="handtekening_verhuurder.png"/>
+                          <pic:cNvPicPr/>
+                        </pic:nvPicPr>
+                        <pic:blipFill>
+                          <a:blip r:embed="rIdHandtekening"/>
+                          <a:stretch>
+                            <a:fillRect/>
+                          </a:stretch>
+                        </pic:blipFill>
+                        <pic:spPr>
+                          <a:xfrm>
+                            <a:off x="0" y="0"/>
+                            <a:ext cx="313610" cy="792000"/>
+                          </a:xfrm>
+                          <a:prstGeom prst="rect">
+                            <a:avLst/>
+                          </a:prstGeom>
+                        </pic:spPr>
+                      </pic:pic>
+                    </a:graphicData>
+                  </a:graphic>
+                </wp:inline>
+              </w:drawing>
+            </w:r>
           </w:p>
         </w:tc>
         <w:tc>

</xml_diff>

<commit_message>
feat: huurovereenkomst en informatieblad in huisstijl KTP Backoffice
Uit het briefpapier: logobalk en groene hoek bovenaan elke pagina, groene
lijn met adresregel onder Paraaf/paginanummer, koppen in KTP-blauw (#2B3B93).
Afbeeldingen in scripts/sjablonen/huisstijl/ (het briefpapier zelf staat
niet in de repo). Bovenmarge 3,7 cm voor de logobalk.

Co-Authored-By: Claude Opus 5.5 <noreply@anthropic.com>
Claude-Session: https://claude.ai/code/session_01SAAzUTQoYuHM6bVGxVPSz1
</commit_message>
<xml_diff>
--- a/public/sjablonen/huurovereenkomst_EN.docx
+++ b/public/sjablonen/huurovereenkomst_EN.docx
@@ -19,6 +19,7 @@
           <w:caps/>
           <w:sz w:val="40"/>
           <w:szCs w:val="40"/>
+          <w:color w:val="2B3B93"/>
         </w:rPr>
         <w:t>huurovereenkomst woonruimte</w:t>
       </w:r>
@@ -57,6 +58,7 @@
           <w:caps/>
           <w:sz w:val="28"/>
           <w:szCs w:val="28"/>
+          <w:color w:val="2B3B93"/>
         </w:rPr>
         <w:t xml:space="preserve">naar </w:t>
       </w:r>
@@ -66,6 +68,7 @@
           <w:caps/>
           <w:sz w:val="28"/>
           <w:szCs w:val="28"/>
+          <w:color w:val="2B3B93"/>
         </w:rPr>
         <w:t xml:space="preserve">zijn </w:t>
       </w:r>
@@ -75,6 +78,7 @@
           <w:caps/>
           <w:sz w:val="28"/>
           <w:szCs w:val="28"/>
+          <w:color w:val="2B3B93"/>
         </w:rPr>
         <w:t>aard van korte duur</w:t>
       </w:r>
@@ -123,6 +127,7 @@
           <w:caps/>
           <w:sz w:val="26"/>
           <w:szCs w:val="40"/>
+          <w:color w:val="2B3B93"/>
         </w:rPr>
         <w:t>De ondergetekenden:</w:t>
       </w:r>
@@ -816,6 +821,7 @@
           <w:caps/>
           <w:sz w:val="26"/>
           <w:szCs w:val="40"/>
+          <w:color w:val="2B3B93"/>
         </w:rPr>
         <w:t>Nemen in aanmerking dat:</w:t>
       </w:r>
@@ -1512,6 +1518,7 @@
           <w:caps/>
           <w:sz w:val="26"/>
           <w:szCs w:val="40"/>
+          <w:color w:val="2B3B93"/>
         </w:rPr>
         <w:t>En verklaren te zijn overeengekomen als volgt:</w:t>
       </w:r>
@@ -9202,7 +9209,7 @@
           <w:footerReference w:type="default" r:id="rId9"/>
           <w:type w:val="continuous"/>
           <w:pgSz w:w="11907" w:h="16840" w:code="9"/>
-          <w:pgMar w:top="1985" w:right="1701" w:bottom="1701" w:left="1701" w:header="1985" w:footer="397" w:gutter="0"/>
+          <w:pgMar w:top="2100" w:right="1701" w:bottom="1701" w:left="1701" w:header="720" w:footer="397" w:gutter="0"/>
           <w:cols w:space="720"/>
           <w:docGrid w:linePitch="360"/>
         </w:sectPr>
@@ -9222,7 +9229,7 @@
           <w:footerReference w:type="default" r:id="rId9"/>
           <w:type w:val="continuous"/>
           <w:pgSz w:w="11907" w:h="16840" w:code="9"/>
-          <w:pgMar w:top="1985" w:right="1701" w:bottom="1701" w:left="1701" w:header="1985" w:footer="397" w:gutter="0"/>
+          <w:pgMar w:top="2100" w:right="1701" w:bottom="1701" w:left="1701" w:header="720" w:footer="397" w:gutter="0"/>
           <w:cols w:space="720"/>
           <w:docGrid w:linePitch="360"/>
         </w:sectPr>
@@ -9248,13 +9255,22 @@
         <w:spacing w:after="20"/>
       </w:pPr>
       <w:r>
+        <w:rPr>
+          <w:color w:val="2B3B93"/>
+        </w:rPr>
         <w:lastRenderedPageBreak/>
         <w:t xml:space="preserve">Bijlage: </w:t>
       </w:r>
       <w:r>
+        <w:rPr>
+          <w:color w:val="2B3B93"/>
+        </w:rPr>
         <w:t>H</w:t>
       </w:r>
       <w:r>
+        <w:rPr>
+          <w:color w:val="2B3B93"/>
+        </w:rPr>
         <w:t>uurbevestiging</w:t>
       </w:r>
     </w:p>
@@ -10419,7 +10435,7 @@
     </w:p>
     <w:sectPr>
       <w:pgSz w:w="11907" w:h="16840" w:code="9"/>
-      <w:pgMar w:top="1985" w:right="1701" w:bottom="1701" w:left="1701" w:header="1985" w:footer="397" w:gutter="0"/>
+      <w:pgMar w:top="2100" w:right="1701" w:bottom="1701" w:left="1701" w:header="720" w:footer="397" w:gutter="0"/>
       <w:cols w:space="720"/>
       <w:docGrid w:linePitch="360"/>
     </w:sectPr>
@@ -10526,6 +10542,24 @@
       <w:fldChar w:fldCharType="end"/>
     </w:r>
   </w:p>
+  <w:p>
+    <w:pPr>
+      <w:pBdr>
+        <w:top w:val="single" w:sz="6" w:space="6" w:color="599240"/>
+      </w:pBdr>
+      <w:spacing w:before="120" w:after="0"/>
+      <w:jc w:val="center"/>
+    </w:pPr>
+    <w:r>
+      <w:rPr>
+        <w:rFonts w:ascii="Arial" w:hAnsi="Arial" w:cs="Arial"/>
+        <w:color w:val="599240"/>
+        <w:sz w:val="16"/>
+        <w:szCs w:val="16"/>
+      </w:rPr>
+      <w:t xml:space="preserve">KTP Backoffice   |   Kanaalstraat 217, 7547 AS Enschede   |   053-7113495   |   info@ktp.nl</w:t>
+    </w:r>
+  </w:p>
 </w:ftr>
 </file>
 
@@ -10555,12 +10589,107 @@
 </file>
 
 <file path=word/header1.xml><?xml version="1.0" encoding="utf-8"?>
-<w:hdr xmlns:wpc="http://schemas.microsoft.com/office/word/2010/wordprocessingCanvas" xmlns:cx="http://schemas.microsoft.com/office/drawing/2014/chartex" xmlns:cx1="http://schemas.microsoft.com/office/drawing/2015/9/8/chartex" xmlns:cx2="http://schemas.microsoft.com/office/drawing/2015/10/21/chartex" xmlns:cx3="http://schemas.microsoft.com/office/drawing/2016/5/9/chartex" xmlns:cx4="http://schemas.microsoft.com/office/drawing/2016/5/10/chartex" xmlns:cx5="http://schemas.microsoft.com/office/drawing/2016/5/11/chartex" xmlns:cx6="http://schemas.microsoft.com/office/drawing/2016/5/12/chartex" xmlns:cx7="http://schemas.microsoft.com/office/drawing/2016/5/13/chartex" xmlns:cx8="http://schemas.microsoft.com/office/drawing/2016/5/14/chartex" xmlns:mc="http://schemas.openxmlformats.org/markup-compatibility/2006" xmlns:aink="http://schemas.microsoft.com/office/drawing/2016/ink" xmlns:am3d="http://schemas.microsoft.com/office/drawing/2017/model3d" xmlns:o="urn:schemas-microsoft-com:office:office" xmlns:oel="http://schemas.microsoft.com/office/2019/extlst" xmlns:r="http://schemas.openxmlformats.org/officeDocument/2006/relationships" xmlns:m="http://schemas.openxmlformats.org/officeDocument/2006/math" xmlns:v="urn:schemas-microsoft-com:vml" xmlns:wp14="http://schemas.microsoft.com/office/word/2010/wordprocessingDrawing" xmlns:wp="http://schemas.openxmlformats.org/drawingml/2006/wordprocessingDrawing" xmlns:w10="urn:schemas-microsoft-com:office:word" xmlns:w="http://schemas.openxmlformats.org/wordprocessingml/2006/main" xmlns:w14="http://schemas.microsoft.com/office/word/2010/wordml" xmlns:w15="http://schemas.microsoft.com/office/word/2012/wordml" xmlns:w16cex="http://schemas.microsoft.com/office/word/2018/wordml/cex" xmlns:w16cid="http://schemas.microsoft.com/office/word/2016/wordml/cid" xmlns:w16="http://schemas.microsoft.com/office/word/2018/wordml" xmlns:w16du="http://schemas.microsoft.com/office/word/2023/wordml/word16du" xmlns:w16sdtdh="http://schemas.microsoft.com/office/word/2020/wordml/sdtdatahash" xmlns:w16sdtfl="http://schemas.microsoft.com/office/word/2024/wordml/sdtformatlock" xmlns:w16se="http://schemas.microsoft.com/office/word/2015/wordml/symex" xmlns:wpg="http://schemas.microsoft.com/office/word/2010/wordprocessingGroup" xmlns:wpi="http://schemas.microsoft.com/office/word/2010/wordprocessingInk" xmlns:wne="http://schemas.microsoft.com/office/word/2006/wordml" xmlns:wps="http://schemas.microsoft.com/office/word/2010/wordprocessingShape" mc:Ignorable="w14 w15 w16se w16cid w16 w16cex w16sdtdh w16sdtfl w16du wp14">
+<w:hdr xmlns:w="http://schemas.openxmlformats.org/wordprocessingml/2006/main" xmlns:r="http://schemas.openxmlformats.org/officeDocument/2006/relationships" xmlns:wp="http://schemas.openxmlformats.org/drawingml/2006/wordprocessingDrawing" xmlns:a="http://schemas.openxmlformats.org/drawingml/2006/main" xmlns:pic="http://schemas.openxmlformats.org/drawingml/2006/picture">
   <w:p>
     <w:pPr>
-      <w:pStyle w:val="PCStandaard"/>
-      <w:jc w:val="right"/>
+      <w:spacing w:before="0" w:after="0"/>
     </w:pPr>
+    <w:r>
+      <w:rPr>
+        <w:noProof/>
+      </w:rPr>
+      <w:drawing>
+        <wp:anchor distT="0" distB="0" distL="0" distR="0" simplePos="0" relativeHeight="251658241" behindDoc="0" locked="0" layoutInCell="1" allowOverlap="1">
+          <wp:simplePos x="0" y="0"/>
+          <wp:positionH relativeFrom="page">
+            <wp:posOffset>1647825</wp:posOffset>
+          </wp:positionH>
+          <wp:positionV relativeFrom="page">
+            <wp:posOffset>161925</wp:posOffset>
+          </wp:positionV>
+          <wp:extent cx="5731510" cy="1003935"/>
+          <wp:effectExtent l="0" t="0" r="0" b="0"/>
+          <wp:wrapNone/>
+          <wp:docPr id="9101" name="KTP Backoffice logo"/>
+          <wp:cNvGraphicFramePr>
+            <a:graphicFrameLocks noChangeAspect="1"/>
+          </wp:cNvGraphicFramePr>
+          <a:graphic>
+            <a:graphicData uri="http://schemas.openxmlformats.org/drawingml/2006/picture">
+              <pic:pic>
+                <pic:nvPicPr>
+                  <pic:cNvPr id="9101" name="KTP Backoffice logo"/>
+                  <pic:cNvPicPr/>
+                </pic:nvPicPr>
+                <pic:blipFill>
+                  <a:blip r:embed="rIdKtpLogo"/>
+                  <a:stretch>
+                    <a:fillRect/>
+                  </a:stretch>
+                </pic:blipFill>
+                <pic:spPr>
+                  <a:xfrm>
+                    <a:off x="0" y="0"/>
+                    <a:ext cx="5731510" cy="1003935"/>
+                  </a:xfrm>
+                  <a:prstGeom prst="rect">
+                    <a:avLst/>
+                  </a:prstGeom>
+                </pic:spPr>
+              </pic:pic>
+            </a:graphicData>
+          </a:graphic>
+        </wp:anchor>
+      </w:drawing>
+    </w:r>
+    <w:r>
+      <w:rPr>
+        <w:noProof/>
+      </w:rPr>
+      <w:drawing>
+        <wp:anchor distT="0" distB="0" distL="0" distR="0" simplePos="0" relativeHeight="251658242" behindDoc="0" locked="0" layoutInCell="1" allowOverlap="1">
+          <wp:simplePos x="0" y="0"/>
+          <wp:positionH relativeFrom="page">
+            <wp:posOffset>0</wp:posOffset>
+          </wp:positionH>
+          <wp:positionV relativeFrom="page">
+            <wp:posOffset>0</wp:posOffset>
+          </wp:positionV>
+          <wp:extent cx="1514475" cy="1085850"/>
+          <wp:effectExtent l="0" t="0" r="0" b="0"/>
+          <wp:wrapNone/>
+          <wp:docPr id="9102" name="KTP hoek"/>
+          <wp:cNvGraphicFramePr>
+            <a:graphicFrameLocks noChangeAspect="1"/>
+          </wp:cNvGraphicFramePr>
+          <a:graphic>
+            <a:graphicData uri="http://schemas.openxmlformats.org/drawingml/2006/picture">
+              <pic:pic>
+                <pic:nvPicPr>
+                  <pic:cNvPr id="9102" name="KTP hoek"/>
+                  <pic:cNvPicPr/>
+                </pic:nvPicPr>
+                <pic:blipFill>
+                  <a:blip r:embed="rIdKtpHoek"/>
+                  <a:stretch>
+                    <a:fillRect/>
+                  </a:stretch>
+                </pic:blipFill>
+                <pic:spPr>
+                  <a:xfrm>
+                    <a:off x="0" y="0"/>
+                    <a:ext cx="1514475" cy="1085850"/>
+                  </a:xfrm>
+                  <a:prstGeom prst="rect">
+                    <a:avLst/>
+                  </a:prstGeom>
+                </pic:spPr>
+              </pic:pic>
+            </a:graphicData>
+          </a:graphic>
+        </wp:anchor>
+      </w:drawing>
+    </w:r>
   </w:p>
 </w:hdr>
 </file>
@@ -13476,6 +13605,7 @@
       <w:kern w:val="32"/>
       <w:sz w:val="26"/>
       <w:szCs w:val="32"/>
+      <w:color w:val="2B3B93"/>
     </w:rPr>
   </w:style>
   <w:style w:type="paragraph" w:styleId="Kop2">
@@ -13498,6 +13628,7 @@
       <w:caps/>
       <w:sz w:val="20"/>
       <w:szCs w:val="28"/>
+      <w:color w:val="2B3B93"/>
     </w:rPr>
   </w:style>
   <w:style w:type="paragraph" w:styleId="Kop3">
@@ -15782,6 +15913,7 @@
       <w:kern w:val="28"/>
       <w:sz w:val="56"/>
       <w:szCs w:val="56"/>
+      <w:color w:val="2B3B93"/>
     </w:rPr>
   </w:style>
   <w:style w:type="character" w:customStyle="1" w:styleId="TitelChar">

</xml_diff>